<commit_message>
Include complete fusion comparison table in reviewer response
</commit_message>
<xml_diff>
--- a/docs/review/response_to_reviewers_original_baseline_aligned.docx
+++ b/docs/review/response_to_reviewers_original_baseline_aligned.docx
@@ -842,6 +842,17 @@
         </w:rPr>
         <w:t>This review is not a meta-analysis. Because the reviewed studies use different datasets, spatial resolutions, class schemes, train/test splits, hardware, training budgets and reporting conventions, their reported accuracy and runtime values were not pooled into a numerical ranking. Instead, the table compares dimensions that can be assessed consistently across fusion levels and specifies the controlled baselines, ablations, calibration analyses and stress tests needed for future quantitative comparisons.</w:t>
       </w:r>
+      <w:r>
+        <w:rPr>
+          <w:rFonts w:ascii="Verdana" w:hAnsi="Verdana"/>
+          <w:b w:val="0"/>
+          <w:i w:val="0"/>
+          <w:color w:val="1F4E79"/>
+          <w:sz w:val="18"/>
+          <w:lang w:val="en-GB"/>
+        </w:rPr>
+        <w:t xml:space="preserve"> The new Table 4 is reproduced below for ease of review.</w:t>
+      </w:r>
     </w:p>
     <w:p>
       <w:pPr>
@@ -850,6 +861,13 @@
         <w:widowControl/>
         <w:spacing w:before="0" w:after="120" w:line="252" w:lineRule="auto"/>
         <w:jc w:val="both"/>
+        <w:sectPr>
+          <w:type w:val="nextPage"/>
+          <w:pgSz w:w="11909" w:h="16834"/>
+          <w:pgMar w:top="1440" w:right="1800" w:bottom="1440" w:left="1800" w:header="720" w:footer="720" w:gutter="0"/>
+          <w:cols w:space="425"/>
+          <w:docGrid w:type="lines" w:linePitch="312"/>
+        </w:sectPr>
       </w:pPr>
       <w:r>
         <w:rPr>
@@ -872,6 +890,1362 @@
           <w:lang w:val="en-GB"/>
         </w:rPr>
         <w:t>Section 4.3, Analysis of Emerging Research Methods; Table 4, “Design and evaluation considerations for multimodal LULC fusion levels”, and the paragraphs immediately before and after it.</w:t>
+      </w:r>
+    </w:p>
+    <w:p>
+      <w:pPr>
+        <w:keepNext/>
+        <w:widowControl/>
+        <w:spacing w:before="0" w:after="120" w:line="259" w:lineRule="auto"/>
+        <w:jc w:val="left"/>
+      </w:pPr>
+      <w:r>
+        <w:rPr>
+          <w:rFonts w:ascii="Verdana" w:hAnsi="Verdana"/>
+          <w:b/>
+          <w:i w:val="0"/>
+          <w:color w:val="1F4E79"/>
+          <w:sz w:val="19"/>
+          <w:lang w:val="en-GB"/>
+        </w:rPr>
+        <w:t xml:space="preserve">Table 4. </w:t>
+      </w:r>
+      <w:r>
+        <w:rPr>
+          <w:rFonts w:ascii="Verdana" w:hAnsi="Verdana"/>
+          <w:b w:val="0"/>
+          <w:i w:val="0"/>
+          <w:color w:val="1F4E79"/>
+          <w:sz w:val="19"/>
+          <w:lang w:val="en-GB"/>
+        </w:rPr>
+        <w:t>Design and evaluation considerations for multimodal LULC fusion levels.</w:t>
+      </w:r>
+    </w:p>
+    <w:tbl>
+      <w:tblPr>
+        <w:tblW w:type="dxa" w:w="15106"/>
+        <w:jc w:val="center"/>
+        <w:tblLayout w:type="fixed"/>
+        <w:tblLook w:firstColumn="1" w:firstRow="1" w:lastColumn="0" w:lastRow="0" w:noHBand="0" w:noVBand="1" w:val="04A0"/>
+        <w:tblBorders>
+          <w:top w:val="single" w:sz="4" w:color="D9D9D9"/>
+          <w:left w:val="single" w:sz="4" w:color="D9D9D9"/>
+          <w:bottom w:val="single" w:sz="4" w:color="D9D9D9"/>
+          <w:right w:val="single" w:sz="4" w:color="D9D9D9"/>
+          <w:insideH w:val="single" w:sz="4" w:color="D9D9D9"/>
+          <w:insideV w:val="single" w:sz="4" w:color="D9D9D9"/>
+        </w:tblBorders>
+      </w:tblPr>
+      <w:tblGrid>
+        <w:gridCol w:w="1382"/>
+        <w:gridCol w:w="3240"/>
+        <w:gridCol w:w="3370"/>
+        <w:gridCol w:w="2981"/>
+        <w:gridCol w:w="4133"/>
+      </w:tblGrid>
+      <w:tr>
+        <w:trPr>
+          <w:cantSplit/>
+          <w:tblHeader/>
+        </w:trPr>
+        <w:tc>
+          <w:tcPr>
+            <w:tcW w:type="dxa" w:w="1382"/>
+            <w:vAlign w:val="center"/>
+            <w:tcMar>
+              <w:top w:w="75" w:type="dxa"/>
+              <w:bottom w:w="75" w:type="dxa"/>
+              <w:left w:w="80" w:type="dxa"/>
+              <w:right w:w="80" w:type="dxa"/>
+            </w:tcMar>
+            <w:shd w:fill="EAF0F6"/>
+          </w:tcPr>
+          <w:p>
+            <w:pPr>
+              <w:keepNext w:val="0"/>
+              <w:widowControl/>
+              <w:spacing w:before="0" w:after="0" w:line="259" w:lineRule="auto"/>
+              <w:jc w:val="left"/>
+            </w:pPr>
+            <w:r>
+              <w:rPr>
+                <w:rFonts w:ascii="Verdana" w:hAnsi="Verdana"/>
+                <w:b/>
+                <w:i w:val="0"/>
+                <w:color w:val="000000"/>
+                <w:sz w:val="18"/>
+                <w:lang w:val="en-GB"/>
+              </w:rPr>
+              <w:t>Fusion level</w:t>
+            </w:r>
+          </w:p>
+        </w:tc>
+        <w:tc>
+          <w:tcPr>
+            <w:tcW w:type="dxa" w:w="3240"/>
+            <w:vAlign w:val="center"/>
+            <w:tcMar>
+              <w:top w:w="75" w:type="dxa"/>
+              <w:bottom w:w="75" w:type="dxa"/>
+              <w:left w:w="80" w:type="dxa"/>
+              <w:right w:w="80" w:type="dxa"/>
+            </w:tcMar>
+            <w:shd w:fill="EAF0F6"/>
+          </w:tcPr>
+          <w:p>
+            <w:pPr>
+              <w:keepNext w:val="0"/>
+              <w:widowControl/>
+              <w:spacing w:before="0" w:after="0" w:line="259" w:lineRule="auto"/>
+              <w:jc w:val="left"/>
+            </w:pPr>
+            <w:r>
+              <w:rPr>
+                <w:rFonts w:ascii="Verdana" w:hAnsi="Verdana"/>
+                <w:b/>
+                <w:i w:val="0"/>
+                <w:color w:val="000000"/>
+                <w:sz w:val="18"/>
+                <w:lang w:val="en-GB"/>
+              </w:rPr>
+              <w:t>Integration and data needs</w:t>
+            </w:r>
+          </w:p>
+        </w:tc>
+        <w:tc>
+          <w:tcPr>
+            <w:tcW w:type="dxa" w:w="3370"/>
+            <w:vAlign w:val="center"/>
+            <w:tcMar>
+              <w:top w:w="75" w:type="dxa"/>
+              <w:bottom w:w="75" w:type="dxa"/>
+              <w:left w:w="80" w:type="dxa"/>
+              <w:right w:w="80" w:type="dxa"/>
+            </w:tcMar>
+            <w:shd w:fill="EAF0F6"/>
+          </w:tcPr>
+          <w:p>
+            <w:pPr>
+              <w:keepNext w:val="0"/>
+              <w:widowControl/>
+              <w:spacing w:before="0" w:after="0" w:line="259" w:lineRule="auto"/>
+              <w:jc w:val="left"/>
+            </w:pPr>
+            <w:r>
+              <w:rPr>
+                <w:rFonts w:ascii="Verdana" w:hAnsi="Verdana"/>
+                <w:b/>
+                <w:i w:val="0"/>
+                <w:color w:val="000000"/>
+                <w:sz w:val="18"/>
+                <w:lang w:val="en-GB"/>
+              </w:rPr>
+              <w:t>Training and computation</w:t>
+            </w:r>
+          </w:p>
+        </w:tc>
+        <w:tc>
+          <w:tcPr>
+            <w:tcW w:type="dxa" w:w="2981"/>
+            <w:vAlign w:val="center"/>
+            <w:tcMar>
+              <w:top w:w="75" w:type="dxa"/>
+              <w:bottom w:w="75" w:type="dxa"/>
+              <w:left w:w="80" w:type="dxa"/>
+              <w:right w:w="80" w:type="dxa"/>
+            </w:tcMar>
+            <w:shd w:fill="EAF0F6"/>
+          </w:tcPr>
+          <w:p>
+            <w:pPr>
+              <w:keepNext w:val="0"/>
+              <w:widowControl/>
+              <w:spacing w:before="0" w:after="0" w:line="259" w:lineRule="auto"/>
+              <w:jc w:val="left"/>
+            </w:pPr>
+            <w:r>
+              <w:rPr>
+                <w:rFonts w:ascii="Verdana" w:hAnsi="Verdana"/>
+                <w:b/>
+                <w:i w:val="0"/>
+                <w:color w:val="000000"/>
+                <w:sz w:val="18"/>
+                <w:lang w:val="en-GB"/>
+              </w:rPr>
+              <w:t>Key risks</w:t>
+            </w:r>
+          </w:p>
+        </w:tc>
+        <w:tc>
+          <w:tcPr>
+            <w:tcW w:type="dxa" w:w="4133"/>
+            <w:vAlign w:val="center"/>
+            <w:tcMar>
+              <w:top w:w="75" w:type="dxa"/>
+              <w:bottom w:w="75" w:type="dxa"/>
+              <w:left w:w="80" w:type="dxa"/>
+              <w:right w:w="80" w:type="dxa"/>
+            </w:tcMar>
+            <w:shd w:fill="EAF0F6"/>
+          </w:tcPr>
+          <w:p>
+            <w:pPr>
+              <w:keepNext w:val="0"/>
+              <w:widowControl/>
+              <w:spacing w:before="0" w:after="0" w:line="259" w:lineRule="auto"/>
+              <w:jc w:val="left"/>
+            </w:pPr>
+            <w:r>
+              <w:rPr>
+                <w:rFonts w:ascii="Verdana" w:hAnsi="Verdana"/>
+                <w:b/>
+                <w:i w:val="0"/>
+                <w:color w:val="000000"/>
+                <w:sz w:val="18"/>
+                <w:lang w:val="en-GB"/>
+              </w:rPr>
+              <w:t>Minimum evidence and suitable conditions</w:t>
+            </w:r>
+          </w:p>
+        </w:tc>
+      </w:tr>
+      <w:tr>
+        <w:trPr>
+          <w:cantSplit/>
+        </w:trPr>
+        <w:tc>
+          <w:tcPr>
+            <w:tcW w:type="dxa" w:w="1382"/>
+            <w:vAlign w:val="center"/>
+            <w:tcMar>
+              <w:top w:w="75" w:type="dxa"/>
+              <w:bottom w:w="75" w:type="dxa"/>
+              <w:left w:w="80" w:type="dxa"/>
+              <w:right w:w="80" w:type="dxa"/>
+            </w:tcMar>
+            <w:shd w:fill="FFFFFF"/>
+          </w:tcPr>
+          <w:p>
+            <w:pPr>
+              <w:keepNext w:val="0"/>
+              <w:widowControl/>
+              <w:spacing w:before="0" w:after="0" w:line="259" w:lineRule="auto"/>
+              <w:jc w:val="left"/>
+            </w:pPr>
+            <w:r>
+              <w:rPr>
+                <w:rFonts w:ascii="Verdana" w:hAnsi="Verdana"/>
+                <w:b w:val="0"/>
+                <w:i w:val="0"/>
+                <w:color w:val="1F4E79"/>
+                <w:sz w:val="18"/>
+                <w:lang w:val="en-GB"/>
+              </w:rPr>
+              <w:t>Data-level</w:t>
+            </w:r>
+          </w:p>
+        </w:tc>
+        <w:tc>
+          <w:tcPr>
+            <w:tcW w:type="dxa" w:w="3240"/>
+            <w:vAlign w:val="center"/>
+            <w:tcMar>
+              <w:top w:w="75" w:type="dxa"/>
+              <w:bottom w:w="75" w:type="dxa"/>
+              <w:left w:w="80" w:type="dxa"/>
+              <w:right w:w="80" w:type="dxa"/>
+            </w:tcMar>
+            <w:shd w:fill="FFFFFF"/>
+          </w:tcPr>
+          <w:p>
+            <w:pPr>
+              <w:keepNext w:val="0"/>
+              <w:widowControl/>
+              <w:spacing w:before="0" w:after="0" w:line="259" w:lineRule="auto"/>
+              <w:jc w:val="left"/>
+            </w:pPr>
+            <w:r>
+              <w:rPr>
+                <w:rFonts w:ascii="Verdana" w:hAnsi="Verdana"/>
+                <w:b w:val="0"/>
+                <w:i w:val="0"/>
+                <w:color w:val="1F4E79"/>
+                <w:sz w:val="18"/>
+                <w:lang w:val="en-GB"/>
+              </w:rPr>
+              <w:t>Combines co-registered inputs before representation learning. Grid concatenation requires spatial correspondence and sensor-appropriate normalisation.</w:t>
+            </w:r>
+          </w:p>
+        </w:tc>
+        <w:tc>
+          <w:tcPr>
+            <w:tcW w:type="dxa" w:w="3370"/>
+            <w:vAlign w:val="center"/>
+            <w:tcMar>
+              <w:top w:w="75" w:type="dxa"/>
+              <w:bottom w:w="75" w:type="dxa"/>
+              <w:left w:w="80" w:type="dxa"/>
+              <w:right w:w="80" w:type="dxa"/>
+            </w:tcMar>
+            <w:shd w:fill="FFFFFF"/>
+          </w:tcPr>
+          <w:p>
+            <w:pPr>
+              <w:keepNext w:val="0"/>
+              <w:widowControl/>
+              <w:spacing w:before="0" w:after="0" w:line="259" w:lineRule="auto"/>
+              <w:jc w:val="left"/>
+            </w:pPr>
+            <w:r>
+              <w:rPr>
+                <w:rFonts w:ascii="Verdana" w:hAnsi="Verdana"/>
+                <w:b w:val="0"/>
+                <w:i w:val="0"/>
+                <w:color w:val="1F4E79"/>
+                <w:sz w:val="18"/>
+                <w:lang w:val="en-GB"/>
+              </w:rPr>
+              <w:t xml:space="preserve">Usually trained jointly. Concatenation increases encoder input width to </w:t>
+            </w:r>
+            <m:oMath>
+              <m:sSub>
+                <m:e>
+                  <m:r>
+                    <w:rPr>
+                      <w:rFonts w:ascii="Cambria Math" w:hAnsi="Cambria Math"/>
+                      <w:color w:val="1F4E79"/>
+                      <w:sz w:val="18"/>
+                    </w:rPr>
+                    <m:t>∑</m:t>
+                  </m:r>
+                </m:e>
+                <m:sub>
+                  <m:r>
+                    <w:rPr>
+                      <w:rFonts w:ascii="Cambria Math" w:hAnsi="Cambria Math"/>
+                      <w:color w:val="1F4E79"/>
+                      <w:sz w:val="18"/>
+                    </w:rPr>
+                    <m:t>m</m:t>
+                  </m:r>
+                </m:sub>
+              </m:sSub>
+              <m:sSub>
+                <m:e>
+                  <m:r>
+                    <w:rPr>
+                      <w:rFonts w:ascii="Cambria Math" w:hAnsi="Cambria Math"/>
+                      <w:color w:val="1F4E79"/>
+                      <w:sz w:val="18"/>
+                    </w:rPr>
+                    <m:t>d</m:t>
+                  </m:r>
+                </m:e>
+                <m:sub>
+                  <m:r>
+                    <w:rPr>
+                      <w:rFonts w:ascii="Cambria Math" w:hAnsi="Cambria Math"/>
+                      <w:color w:val="1F4E79"/>
+                      <w:sz w:val="18"/>
+                    </w:rPr>
+                    <m:t>m</m:t>
+                  </m:r>
+                </m:sub>
+              </m:sSub>
+            </m:oMath>
+            <w:r>
+              <w:rPr>
+                <w:rFonts w:ascii="Verdana" w:hAnsi="Verdana"/>
+                <w:b w:val="0"/>
+                <w:i w:val="0"/>
+                <w:color w:val="1F4E79"/>
+                <w:sz w:val="18"/>
+                <w:lang w:val="en-GB"/>
+              </w:rPr>
+              <w:t>; cost grows with source count and preprocessing.</w:t>
+            </w:r>
+          </w:p>
+        </w:tc>
+        <w:tc>
+          <w:tcPr>
+            <w:tcW w:type="dxa" w:w="2981"/>
+            <w:vAlign w:val="center"/>
+            <w:tcMar>
+              <w:top w:w="75" w:type="dxa"/>
+              <w:bottom w:w="75" w:type="dxa"/>
+              <w:left w:w="80" w:type="dxa"/>
+              <w:right w:w="80" w:type="dxa"/>
+            </w:tcMar>
+            <w:shd w:fill="FFFFFF"/>
+          </w:tcPr>
+          <w:p>
+            <w:pPr>
+              <w:keepNext w:val="0"/>
+              <w:widowControl/>
+              <w:spacing w:before="0" w:after="0" w:line="259" w:lineRule="auto"/>
+              <w:jc w:val="left"/>
+            </w:pPr>
+            <w:r>
+              <w:rPr>
+                <w:rFonts w:ascii="Verdana" w:hAnsi="Verdana"/>
+                <w:b w:val="0"/>
+                <w:i w:val="0"/>
+                <w:color w:val="1F4E79"/>
+                <w:sz w:val="18"/>
+                <w:lang w:val="en-GB"/>
+              </w:rPr>
+              <w:t>Misregistration, acquisition-time mismatch, redundant or noisy bands, and dominance of a high-dimensional source.</w:t>
+            </w:r>
+          </w:p>
+        </w:tc>
+        <w:tc>
+          <w:tcPr>
+            <w:tcW w:type="dxa" w:w="4133"/>
+            <w:vAlign w:val="center"/>
+            <w:tcMar>
+              <w:top w:w="75" w:type="dxa"/>
+              <w:bottom w:w="75" w:type="dxa"/>
+              <w:left w:w="80" w:type="dxa"/>
+              <w:right w:w="80" w:type="dxa"/>
+            </w:tcMar>
+            <w:shd w:fill="FFFFFF"/>
+          </w:tcPr>
+          <w:p>
+            <w:pPr>
+              <w:keepNext w:val="0"/>
+              <w:widowControl/>
+              <w:spacing w:before="0" w:after="0" w:line="259" w:lineRule="auto"/>
+              <w:jc w:val="left"/>
+            </w:pPr>
+            <w:r>
+              <w:rPr>
+                <w:rFonts w:ascii="Verdana" w:hAnsi="Verdana"/>
+                <w:b w:val="0"/>
+                <w:i w:val="0"/>
+                <w:color w:val="1F4E79"/>
+                <w:sz w:val="18"/>
+                <w:lang w:val="en-GB"/>
+              </w:rPr>
+              <w:t>Compare each source with concatenation and perturb registration and acquisition time. Most suitable when inputs are accurately aligned and low-level correspondence is important.</w:t>
+            </w:r>
+          </w:p>
+        </w:tc>
+      </w:tr>
+      <w:tr>
+        <w:trPr>
+          <w:cantSplit/>
+        </w:trPr>
+        <w:tc>
+          <w:tcPr>
+            <w:tcW w:type="dxa" w:w="1382"/>
+            <w:vAlign w:val="center"/>
+            <w:tcMar>
+              <w:top w:w="75" w:type="dxa"/>
+              <w:bottom w:w="75" w:type="dxa"/>
+              <w:left w:w="80" w:type="dxa"/>
+              <w:right w:w="80" w:type="dxa"/>
+            </w:tcMar>
+            <w:shd w:fill="FFFFFF"/>
+          </w:tcPr>
+          <w:p>
+            <w:pPr>
+              <w:keepNext w:val="0"/>
+              <w:widowControl/>
+              <w:spacing w:before="0" w:after="0" w:line="259" w:lineRule="auto"/>
+              <w:jc w:val="left"/>
+            </w:pPr>
+            <w:r>
+              <w:rPr>
+                <w:rFonts w:ascii="Verdana" w:hAnsi="Verdana"/>
+                <w:b w:val="0"/>
+                <w:i w:val="0"/>
+                <w:color w:val="1F4E79"/>
+                <w:sz w:val="18"/>
+                <w:lang w:val="en-GB"/>
+              </w:rPr>
+              <w:t>Feature-level</w:t>
+            </w:r>
+          </w:p>
+        </w:tc>
+        <w:tc>
+          <w:tcPr>
+            <w:tcW w:type="dxa" w:w="3240"/>
+            <w:vAlign w:val="center"/>
+            <w:tcMar>
+              <w:top w:w="75" w:type="dxa"/>
+              <w:bottom w:w="75" w:type="dxa"/>
+              <w:left w:w="80" w:type="dxa"/>
+              <w:right w:w="80" w:type="dxa"/>
+            </w:tcMar>
+            <w:shd w:fill="FFFFFF"/>
+          </w:tcPr>
+          <w:p>
+            <w:pPr>
+              <w:keepNext w:val="0"/>
+              <w:widowControl/>
+              <w:spacing w:before="0" w:after="0" w:line="259" w:lineRule="auto"/>
+              <w:jc w:val="left"/>
+            </w:pPr>
+            <w:r>
+              <w:rPr>
+                <w:rFonts w:ascii="Verdana" w:hAnsi="Verdana"/>
+                <w:b w:val="0"/>
+                <w:i w:val="0"/>
+                <w:color w:val="1F4E79"/>
+                <w:sz w:val="18"/>
+                <w:lang w:val="en-GB"/>
+              </w:rPr>
+              <w:t>Combines intermediate modality-specific or shared representations. Resampling or learned alignment can accommodate some resolution differences, but semantic correspondence remains necessary.</w:t>
+            </w:r>
+          </w:p>
+        </w:tc>
+        <w:tc>
+          <w:tcPr>
+            <w:tcW w:type="dxa" w:w="3370"/>
+            <w:vAlign w:val="center"/>
+            <w:tcMar>
+              <w:top w:w="75" w:type="dxa"/>
+              <w:bottom w:w="75" w:type="dxa"/>
+              <w:left w:w="80" w:type="dxa"/>
+              <w:right w:w="80" w:type="dxa"/>
+            </w:tcMar>
+            <w:shd w:fill="FFFFFF"/>
+          </w:tcPr>
+          <w:p>
+            <w:pPr>
+              <w:keepNext w:val="0"/>
+              <w:widowControl/>
+              <w:spacing w:before="0" w:after="0" w:line="259" w:lineRule="auto"/>
+              <w:jc w:val="left"/>
+            </w:pPr>
+            <w:r>
+              <w:rPr>
+                <w:rFonts w:ascii="Verdana" w:hAnsi="Verdana"/>
+                <w:b w:val="0"/>
+                <w:i w:val="0"/>
+                <w:color w:val="1F4E79"/>
+                <w:sz w:val="18"/>
+                <w:lang w:val="en-GB"/>
+              </w:rPr>
+              <w:t xml:space="preserve">Uses separate encoders and a fusion module. Dense pairwise cross-attention scales as </w:t>
+            </w:r>
+            <m:oMath>
+              <m:r>
+                <w:rPr>
+                  <w:rFonts w:ascii="Cambria Math" w:hAnsi="Cambria Math"/>
+                  <w:color w:val="1F4E79"/>
+                  <w:sz w:val="18"/>
+                </w:rPr>
+                <m:t>O(</m:t>
+              </m:r>
+              <m:sSub>
+                <m:e>
+                  <m:r>
+                    <w:rPr>
+                      <w:rFonts w:ascii="Cambria Math" w:hAnsi="Cambria Math"/>
+                      <w:color w:val="1F4E79"/>
+                      <w:sz w:val="18"/>
+                    </w:rPr>
+                    <m:t>N</m:t>
+                  </m:r>
+                </m:e>
+                <m:sub>
+                  <m:r>
+                    <w:rPr>
+                      <w:rFonts w:ascii="Cambria Math" w:hAnsi="Cambria Math"/>
+                      <w:color w:val="1F4E79"/>
+                      <w:sz w:val="18"/>
+                    </w:rPr>
+                    <m:t>i</m:t>
+                  </m:r>
+                </m:sub>
+              </m:sSub>
+              <m:sSub>
+                <m:e>
+                  <m:r>
+                    <w:rPr>
+                      <w:rFonts w:ascii="Cambria Math" w:hAnsi="Cambria Math"/>
+                      <w:color w:val="1F4E79"/>
+                      <w:sz w:val="18"/>
+                    </w:rPr>
+                    <m:t>N</m:t>
+                  </m:r>
+                </m:e>
+                <m:sub>
+                  <m:r>
+                    <w:rPr>
+                      <w:rFonts w:ascii="Cambria Math" w:hAnsi="Cambria Math"/>
+                      <w:color w:val="1F4E79"/>
+                      <w:sz w:val="18"/>
+                    </w:rPr>
+                    <m:t>j</m:t>
+                  </m:r>
+                </m:sub>
+              </m:sSub>
+              <m:r>
+                <w:rPr>
+                  <w:rFonts w:ascii="Cambria Math" w:hAnsi="Cambria Math"/>
+                  <w:color w:val="1F4E79"/>
+                  <w:sz w:val="18"/>
+                </w:rPr>
+                <m:t>d</m:t>
+              </m:r>
+              <m:r>
+                <w:rPr>
+                  <w:rFonts w:ascii="Cambria Math" w:hAnsi="Cambria Math"/>
+                  <w:color w:val="1F4E79"/>
+                  <w:sz w:val="18"/>
+                </w:rPr>
+                <m:t>)</m:t>
+              </m:r>
+            </m:oMath>
+            <w:r>
+              <w:rPr>
+                <w:rFonts w:ascii="Verdana" w:hAnsi="Verdana"/>
+                <w:b w:val="0"/>
+                <w:i w:val="0"/>
+                <w:color w:val="1F4E79"/>
+                <w:sz w:val="18"/>
+                <w:lang w:val="en-GB"/>
+              </w:rPr>
+              <w:t xml:space="preserve"> in time and </w:t>
+            </w:r>
+            <m:oMath>
+              <m:r>
+                <w:rPr>
+                  <w:rFonts w:ascii="Cambria Math" w:hAnsi="Cambria Math"/>
+                  <w:color w:val="1F4E79"/>
+                  <w:sz w:val="18"/>
+                </w:rPr>
+                <m:t>O(</m:t>
+              </m:r>
+              <m:sSub>
+                <m:e>
+                  <m:r>
+                    <w:rPr>
+                      <w:rFonts w:ascii="Cambria Math" w:hAnsi="Cambria Math"/>
+                      <w:color w:val="1F4E79"/>
+                      <w:sz w:val="18"/>
+                    </w:rPr>
+                    <m:t>N</m:t>
+                  </m:r>
+                </m:e>
+                <m:sub>
+                  <m:r>
+                    <w:rPr>
+                      <w:rFonts w:ascii="Cambria Math" w:hAnsi="Cambria Math"/>
+                      <w:color w:val="1F4E79"/>
+                      <w:sz w:val="18"/>
+                    </w:rPr>
+                    <m:t>i</m:t>
+                  </m:r>
+                </m:sub>
+              </m:sSub>
+              <m:sSub>
+                <m:e>
+                  <m:r>
+                    <w:rPr>
+                      <w:rFonts w:ascii="Cambria Math" w:hAnsi="Cambria Math"/>
+                      <w:color w:val="1F4E79"/>
+                      <w:sz w:val="18"/>
+                    </w:rPr>
+                    <m:t>N</m:t>
+                  </m:r>
+                </m:e>
+                <m:sub>
+                  <m:r>
+                    <w:rPr>
+                      <w:rFonts w:ascii="Cambria Math" w:hAnsi="Cambria Math"/>
+                      <w:color w:val="1F4E79"/>
+                      <w:sz w:val="18"/>
+                    </w:rPr>
+                    <m:t>j</m:t>
+                  </m:r>
+                </m:sub>
+              </m:sSub>
+              <m:r>
+                <w:rPr>
+                  <w:rFonts w:ascii="Cambria Math" w:hAnsi="Cambria Math"/>
+                  <w:color w:val="1F4E79"/>
+                  <w:sz w:val="18"/>
+                </w:rPr>
+                <m:t>)</m:t>
+              </m:r>
+            </m:oMath>
+            <w:r>
+              <w:rPr>
+                <w:rFonts w:ascii="Verdana" w:hAnsi="Verdana"/>
+                <w:b w:val="0"/>
+                <w:i w:val="0"/>
+                <w:color w:val="1F4E79"/>
+                <w:sz w:val="18"/>
+                <w:lang w:val="en-GB"/>
+              </w:rPr>
+              <w:t xml:space="preserve"> in attention memory (Vaswani et al., 2017).</w:t>
+            </w:r>
+          </w:p>
+        </w:tc>
+        <w:tc>
+          <w:tcPr>
+            <w:tcW w:type="dxa" w:w="2981"/>
+            <w:vAlign w:val="center"/>
+            <w:tcMar>
+              <w:top w:w="75" w:type="dxa"/>
+              <w:bottom w:w="75" w:type="dxa"/>
+              <w:left w:w="80" w:type="dxa"/>
+              <w:right w:w="80" w:type="dxa"/>
+            </w:tcMar>
+            <w:shd w:fill="FFFFFF"/>
+          </w:tcPr>
+          <w:p>
+            <w:pPr>
+              <w:keepNext w:val="0"/>
+              <w:widowControl/>
+              <w:spacing w:before="0" w:after="0" w:line="259" w:lineRule="auto"/>
+              <w:jc w:val="left"/>
+            </w:pPr>
+            <w:r>
+              <w:rPr>
+                <w:rFonts w:ascii="Verdana" w:hAnsi="Verdana"/>
+                <w:b w:val="0"/>
+                <w:i w:val="0"/>
+                <w:color w:val="1F4E79"/>
+                <w:sz w:val="18"/>
+                <w:lang w:val="en-GB"/>
+              </w:rPr>
+              <w:t>Modality dominance, overfitting, alignment shift, and brittleness to missing or corrupted sources.</w:t>
+            </w:r>
+          </w:p>
+        </w:tc>
+        <w:tc>
+          <w:tcPr>
+            <w:tcW w:type="dxa" w:w="4133"/>
+            <w:vAlign w:val="center"/>
+            <w:tcMar>
+              <w:top w:w="75" w:type="dxa"/>
+              <w:bottom w:w="75" w:type="dxa"/>
+              <w:left w:w="80" w:type="dxa"/>
+              <w:right w:w="80" w:type="dxa"/>
+            </w:tcMar>
+            <w:shd w:fill="FFFFFF"/>
+          </w:tcPr>
+          <w:p>
+            <w:pPr>
+              <w:keepNext w:val="0"/>
+              <w:widowControl/>
+              <w:spacing w:before="0" w:after="0" w:line="259" w:lineRule="auto"/>
+              <w:jc w:val="left"/>
+            </w:pPr>
+            <w:r>
+              <w:rPr>
+                <w:rFonts w:ascii="Verdana" w:hAnsi="Verdana"/>
+                <w:b w:val="0"/>
+                <w:i w:val="0"/>
+                <w:color w:val="1F4E79"/>
+                <w:sz w:val="18"/>
+                <w:lang w:val="en-GB"/>
+              </w:rPr>
+              <w:t>Require modality ablation, missing- and misaligned-source stress tests, and a compute-matched late-fusion baseline. Suitable when detailed cross-modal interaction is required.</w:t>
+            </w:r>
+          </w:p>
+        </w:tc>
+      </w:tr>
+      <w:tr>
+        <w:trPr>
+          <w:cantSplit/>
+        </w:trPr>
+        <w:tc>
+          <w:tcPr>
+            <w:tcW w:type="dxa" w:w="1382"/>
+            <w:vAlign w:val="center"/>
+            <w:tcMar>
+              <w:top w:w="75" w:type="dxa"/>
+              <w:bottom w:w="75" w:type="dxa"/>
+              <w:left w:w="80" w:type="dxa"/>
+              <w:right w:w="80" w:type="dxa"/>
+            </w:tcMar>
+            <w:shd w:fill="FFFFFF"/>
+          </w:tcPr>
+          <w:p>
+            <w:pPr>
+              <w:keepNext w:val="0"/>
+              <w:widowControl/>
+              <w:spacing w:before="0" w:after="0" w:line="259" w:lineRule="auto"/>
+              <w:jc w:val="left"/>
+            </w:pPr>
+            <w:r>
+              <w:rPr>
+                <w:rFonts w:ascii="Verdana" w:hAnsi="Verdana"/>
+                <w:b w:val="0"/>
+                <w:i w:val="0"/>
+                <w:color w:val="1F4E79"/>
+                <w:sz w:val="18"/>
+                <w:lang w:val="en-GB"/>
+              </w:rPr>
+              <w:t>Decision-level</w:t>
+            </w:r>
+          </w:p>
+        </w:tc>
+        <w:tc>
+          <w:tcPr>
+            <w:tcW w:type="dxa" w:w="3240"/>
+            <w:vAlign w:val="center"/>
+            <w:tcMar>
+              <w:top w:w="75" w:type="dxa"/>
+              <w:bottom w:w="75" w:type="dxa"/>
+              <w:left w:w="80" w:type="dxa"/>
+              <w:right w:w="80" w:type="dxa"/>
+            </w:tcMar>
+            <w:shd w:fill="FFFFFF"/>
+          </w:tcPr>
+          <w:p>
+            <w:pPr>
+              <w:keepNext w:val="0"/>
+              <w:widowControl/>
+              <w:spacing w:before="0" w:after="0" w:line="259" w:lineRule="auto"/>
+              <w:jc w:val="left"/>
+            </w:pPr>
+            <w:r>
+              <w:rPr>
+                <w:rFonts w:ascii="Verdana" w:hAnsi="Verdana"/>
+                <w:b w:val="0"/>
+                <w:i w:val="0"/>
+                <w:color w:val="1F4E79"/>
+                <w:sz w:val="18"/>
+                <w:lang w:val="en-GB"/>
+              </w:rPr>
+              <w:t>Aggregates scores, probabilities, labels, or maps. Feature spaces need not match, but classes and spatial units must be compatible.</w:t>
+            </w:r>
+          </w:p>
+        </w:tc>
+        <w:tc>
+          <w:tcPr>
+            <w:tcW w:type="dxa" w:w="3370"/>
+            <w:vAlign w:val="center"/>
+            <w:tcMar>
+              <w:top w:w="75" w:type="dxa"/>
+              <w:bottom w:w="75" w:type="dxa"/>
+              <w:left w:w="80" w:type="dxa"/>
+              <w:right w:w="80" w:type="dxa"/>
+            </w:tcMar>
+            <w:shd w:fill="FFFFFF"/>
+          </w:tcPr>
+          <w:p>
+            <w:pPr>
+              <w:keepNext w:val="0"/>
+              <w:widowControl/>
+              <w:spacing w:before="0" w:after="0" w:line="259" w:lineRule="auto"/>
+              <w:jc w:val="left"/>
+            </w:pPr>
+            <w:r>
+              <w:rPr>
+                <w:rFonts w:ascii="Verdana" w:hAnsi="Verdana"/>
+                <w:b w:val="0"/>
+                <w:i w:val="0"/>
+                <w:color w:val="1F4E79"/>
+                <w:sz w:val="18"/>
+                <w:lang w:val="en-GB"/>
+              </w:rPr>
+              <w:t xml:space="preserve">Branches may be trained independently. Simple score averaging adds </w:t>
+            </w:r>
+            <m:oMath>
+              <m:r>
+                <w:rPr>
+                  <w:rFonts w:ascii="Cambria Math" w:hAnsi="Cambria Math"/>
+                  <w:color w:val="1F4E79"/>
+                  <w:sz w:val="18"/>
+                </w:rPr>
+                <m:t>O(MC)</m:t>
+              </m:r>
+            </m:oMath>
+            <w:r>
+              <w:rPr>
+                <w:rFonts w:ascii="Verdana" w:hAnsi="Verdana"/>
+                <w:b w:val="0"/>
+                <w:i w:val="0"/>
+                <w:color w:val="1F4E79"/>
+                <w:sz w:val="18"/>
+                <w:lang w:val="en-GB"/>
+              </w:rPr>
+              <w:t xml:space="preserve"> operations beyond branch inference.</w:t>
+            </w:r>
+          </w:p>
+        </w:tc>
+        <w:tc>
+          <w:tcPr>
+            <w:tcW w:type="dxa" w:w="2981"/>
+            <w:vAlign w:val="center"/>
+            <w:tcMar>
+              <w:top w:w="75" w:type="dxa"/>
+              <w:bottom w:w="75" w:type="dxa"/>
+              <w:left w:w="80" w:type="dxa"/>
+              <w:right w:w="80" w:type="dxa"/>
+            </w:tcMar>
+            <w:shd w:fill="FFFFFF"/>
+          </w:tcPr>
+          <w:p>
+            <w:pPr>
+              <w:keepNext w:val="0"/>
+              <w:widowControl/>
+              <w:spacing w:before="0" w:after="0" w:line="259" w:lineRule="auto"/>
+              <w:jc w:val="left"/>
+            </w:pPr>
+            <w:r>
+              <w:rPr>
+                <w:rFonts w:ascii="Verdana" w:hAnsi="Verdana"/>
+                <w:b w:val="0"/>
+                <w:i w:val="0"/>
+                <w:color w:val="1F4E79"/>
+                <w:sz w:val="18"/>
+                <w:lang w:val="en-GB"/>
+              </w:rPr>
+              <w:t>Miscalibration, correlated errors, incompatible taxonomies, and loss of fine cross-modal interaction.</w:t>
+            </w:r>
+          </w:p>
+        </w:tc>
+        <w:tc>
+          <w:tcPr>
+            <w:tcW w:type="dxa" w:w="4133"/>
+            <w:vAlign w:val="center"/>
+            <w:tcMar>
+              <w:top w:w="75" w:type="dxa"/>
+              <w:bottom w:w="75" w:type="dxa"/>
+              <w:left w:w="80" w:type="dxa"/>
+              <w:right w:w="80" w:type="dxa"/>
+            </w:tcMar>
+            <w:shd w:fill="FFFFFF"/>
+          </w:tcPr>
+          <w:p>
+            <w:pPr>
+              <w:keepNext w:val="0"/>
+              <w:widowControl/>
+              <w:spacing w:before="0" w:after="0" w:line="259" w:lineRule="auto"/>
+              <w:jc w:val="left"/>
+            </w:pPr>
+            <w:r>
+              <w:rPr>
+                <w:rFonts w:ascii="Verdana" w:hAnsi="Verdana"/>
+                <w:b w:val="0"/>
+                <w:i w:val="0"/>
+                <w:color w:val="1F4E79"/>
+                <w:sz w:val="18"/>
+                <w:lang w:val="en-GB"/>
+              </w:rPr>
+              <w:t>Report branch performance, error correlation, calibration, and missing-branch tests. Suitable for ensembles and modular sensor pipelines.</w:t>
+            </w:r>
+          </w:p>
+        </w:tc>
+      </w:tr>
+      <w:tr>
+        <w:trPr>
+          <w:cantSplit/>
+        </w:trPr>
+        <w:tc>
+          <w:tcPr>
+            <w:tcW w:type="dxa" w:w="1382"/>
+            <w:vAlign w:val="center"/>
+            <w:tcMar>
+              <w:top w:w="75" w:type="dxa"/>
+              <w:bottom w:w="75" w:type="dxa"/>
+              <w:left w:w="80" w:type="dxa"/>
+              <w:right w:w="80" w:type="dxa"/>
+            </w:tcMar>
+            <w:shd w:fill="FFFFFF"/>
+          </w:tcPr>
+          <w:p>
+            <w:pPr>
+              <w:keepNext w:val="0"/>
+              <w:widowControl/>
+              <w:spacing w:before="0" w:after="0" w:line="259" w:lineRule="auto"/>
+              <w:jc w:val="left"/>
+            </w:pPr>
+            <w:r>
+              <w:rPr>
+                <w:rFonts w:ascii="Verdana" w:hAnsi="Verdana"/>
+                <w:b w:val="0"/>
+                <w:i w:val="0"/>
+                <w:color w:val="1F4E79"/>
+                <w:sz w:val="18"/>
+                <w:lang w:val="en-GB"/>
+              </w:rPr>
+              <w:t>Hybrid</w:t>
+            </w:r>
+          </w:p>
+        </w:tc>
+        <w:tc>
+          <w:tcPr>
+            <w:tcW w:type="dxa" w:w="3240"/>
+            <w:vAlign w:val="center"/>
+            <w:tcMar>
+              <w:top w:w="75" w:type="dxa"/>
+              <w:bottom w:w="75" w:type="dxa"/>
+              <w:left w:w="80" w:type="dxa"/>
+              <w:right w:w="80" w:type="dxa"/>
+            </w:tcMar>
+            <w:shd w:fill="FFFFFF"/>
+          </w:tcPr>
+          <w:p>
+            <w:pPr>
+              <w:keepNext w:val="0"/>
+              <w:widowControl/>
+              <w:spacing w:before="0" w:after="0" w:line="259" w:lineRule="auto"/>
+              <w:jc w:val="left"/>
+            </w:pPr>
+            <w:r>
+              <w:rPr>
+                <w:rFonts w:ascii="Verdana" w:hAnsi="Verdana"/>
+                <w:b w:val="0"/>
+                <w:i w:val="0"/>
+                <w:color w:val="1F4E79"/>
+                <w:sz w:val="18"/>
+                <w:lang w:val="en-GB"/>
+              </w:rPr>
+              <w:t>Uses explicit fusion at two or more stages, such as feature interaction followed by score aggregation.</w:t>
+            </w:r>
+          </w:p>
+        </w:tc>
+        <w:tc>
+          <w:tcPr>
+            <w:tcW w:type="dxa" w:w="3370"/>
+            <w:vAlign w:val="center"/>
+            <w:tcMar>
+              <w:top w:w="75" w:type="dxa"/>
+              <w:bottom w:w="75" w:type="dxa"/>
+              <w:left w:w="80" w:type="dxa"/>
+              <w:right w:w="80" w:type="dxa"/>
+            </w:tcMar>
+            <w:shd w:fill="FFFFFF"/>
+          </w:tcPr>
+          <w:p>
+            <w:pPr>
+              <w:keepNext w:val="0"/>
+              <w:widowControl/>
+              <w:spacing w:before="0" w:after="0" w:line="259" w:lineRule="auto"/>
+              <w:jc w:val="left"/>
+            </w:pPr>
+            <w:r>
+              <w:rPr>
+                <w:rFonts w:ascii="Verdana" w:hAnsi="Verdana"/>
+                <w:b w:val="0"/>
+                <w:i w:val="0"/>
+                <w:color w:val="1F4E79"/>
+                <w:sz w:val="18"/>
+                <w:lang w:val="en-GB"/>
+              </w:rPr>
+              <w:t>Architecture-dependent and jointly or sequentially trained. Report parameters, floating-point operations, memory, and latency.</w:t>
+            </w:r>
+          </w:p>
+        </w:tc>
+        <w:tc>
+          <w:tcPr>
+            <w:tcW w:type="dxa" w:w="2981"/>
+            <w:vAlign w:val="center"/>
+            <w:tcMar>
+              <w:top w:w="75" w:type="dxa"/>
+              <w:bottom w:w="75" w:type="dxa"/>
+              <w:left w:w="80" w:type="dxa"/>
+              <w:right w:w="80" w:type="dxa"/>
+            </w:tcMar>
+            <w:shd w:fill="FFFFFF"/>
+          </w:tcPr>
+          <w:p>
+            <w:pPr>
+              <w:keepNext w:val="0"/>
+              <w:widowControl/>
+              <w:spacing w:before="0" w:after="0" w:line="259" w:lineRule="auto"/>
+              <w:jc w:val="left"/>
+            </w:pPr>
+            <w:r>
+              <w:rPr>
+                <w:rFonts w:ascii="Verdana" w:hAnsi="Verdana"/>
+                <w:b w:val="0"/>
+                <w:i w:val="0"/>
+                <w:color w:val="1F4E79"/>
+                <w:sz w:val="18"/>
+                <w:lang w:val="en-GB"/>
+              </w:rPr>
+              <w:t>Redundant paths, cross-stage co-adaptation, optimisation instability, error propagation, and unclear attribution of gains.</w:t>
+            </w:r>
+          </w:p>
+        </w:tc>
+        <w:tc>
+          <w:tcPr>
+            <w:tcW w:type="dxa" w:w="4133"/>
+            <w:vAlign w:val="center"/>
+            <w:tcMar>
+              <w:top w:w="75" w:type="dxa"/>
+              <w:bottom w:w="75" w:type="dxa"/>
+              <w:left w:w="80" w:type="dxa"/>
+              <w:right w:w="80" w:type="dxa"/>
+            </w:tcMar>
+            <w:shd w:fill="FFFFFF"/>
+          </w:tcPr>
+          <w:p>
+            <w:pPr>
+              <w:keepNext w:val="0"/>
+              <w:widowControl/>
+              <w:spacing w:before="0" w:after="0" w:line="259" w:lineRule="auto"/>
+              <w:jc w:val="left"/>
+            </w:pPr>
+            <w:r>
+              <w:rPr>
+                <w:rFonts w:ascii="Verdana" w:hAnsi="Verdana"/>
+                <w:b w:val="0"/>
+                <w:i w:val="0"/>
+                <w:color w:val="1F4E79"/>
+                <w:sz w:val="18"/>
+                <w:lang w:val="en-GB"/>
+              </w:rPr>
+              <w:t>Require stage-wise ablation and compute-matched single-level baselines. Suitable when both fine cross-modal interaction and modular prediction are needed.</w:t>
+            </w:r>
+          </w:p>
+        </w:tc>
+      </w:tr>
+    </w:tbl>
+    <w:p>
+      <w:pPr>
+        <w:keepNext w:val="0"/>
+        <w:widowControl/>
+        <w:spacing w:before="100" w:after="80" w:line="259" w:lineRule="auto"/>
+        <w:jc w:val="left"/>
+      </w:pPr>
+      <w:r>
+        <w:rPr>
+          <w:rFonts w:ascii="Verdana" w:hAnsi="Verdana"/>
+          <w:b w:val="0"/>
+          <w:i/>
+          <w:color w:val="1F4E79"/>
+          <w:sz w:val="17"/>
+          <w:lang w:val="en-GB"/>
+        </w:rPr>
+        <w:t xml:space="preserve">Note. </w:t>
+      </w:r>
+      <w:r>
+        <w:rPr>
+          <w:rFonts w:ascii="Verdana" w:hAnsi="Verdana"/>
+          <w:b w:val="0"/>
+          <w:i w:val="0"/>
+          <w:color w:val="1F4E79"/>
+          <w:sz w:val="17"/>
+          <w:lang w:val="en-GB"/>
+        </w:rPr>
+        <w:t>Representative implementations comprise data-level fusion (Ghamisi et al., 2019; Pohl &amp; van Genderen, 1998), feature-level fusion (Ghamisi et al., 2017; Hong, Gao, et al., 2021; Zhang, Yao, Ni, Gao, &amp; Huang, 2023), decision-level fusion (Waske &amp; Benediktsson, 2007), and hybrid feature–decision fusion (Hang et al., 2020). These references illustrate the respective fusion levels; the risks and minimum-evidence recommendations are the authors' synthesis and are not attributed in full to any individual study.</w:t>
+      </w:r>
+    </w:p>
+    <w:p>
+      <w:pPr>
+        <w:keepNext w:val="0"/>
+        <w:widowControl/>
+        <w:spacing w:before="0" w:after="0" w:line="259" w:lineRule="auto"/>
+        <w:jc w:val="left"/>
+        <w:sectPr>
+          <w:type w:val="nextPage"/>
+          <w:pgSz w:w="16834" w:h="11909" w:orient="landscape"/>
+          <w:pgMar w:top="864" w:right="864" w:bottom="864" w:left="864" w:header="720" w:footer="720" w:gutter="0"/>
+          <w:cols w:space="425"/>
+          <w:docGrid w:type="lines" w:linePitch="312"/>
+        </w:sectPr>
+      </w:pPr>
+      <w:r>
+        <w:rPr>
+          <w:rFonts w:ascii="Verdana" w:hAnsi="Verdana"/>
+          <w:b w:val="0"/>
+          <w:i/>
+          <w:color w:val="1F4E79"/>
+          <w:sz w:val="17"/>
+          <w:lang w:val="en-GB"/>
+        </w:rPr>
+        <w:t xml:space="preserve">Notation. </w:t>
+      </w:r>
+      <m:oMath>
+        <m:r>
+          <w:rPr>
+            <w:rFonts w:ascii="Cambria Math" w:hAnsi="Cambria Math"/>
+            <w:color w:val="1F4E79"/>
+            <w:sz w:val="18"/>
+          </w:rPr>
+          <m:t>M</m:t>
+        </m:r>
+      </m:oMath>
+      <w:r>
+        <w:rPr>
+          <w:rFonts w:ascii="Verdana" w:hAnsi="Verdana"/>
+          <w:b w:val="0"/>
+          <w:i w:val="0"/>
+          <w:color w:val="1F4E79"/>
+          <w:sz w:val="17"/>
+          <w:lang w:val="en-GB"/>
+        </w:rPr>
+        <w:t xml:space="preserve"> is the number of modalities, </w:t>
+      </w:r>
+      <m:oMath>
+        <m:r>
+          <w:rPr>
+            <w:rFonts w:ascii="Cambria Math" w:hAnsi="Cambria Math"/>
+            <w:color w:val="1F4E79"/>
+            <w:sz w:val="18"/>
+          </w:rPr>
+          <m:t>C</m:t>
+        </m:r>
+      </m:oMath>
+      <w:r>
+        <w:rPr>
+          <w:rFonts w:ascii="Verdana" w:hAnsi="Verdana"/>
+          <w:b w:val="0"/>
+          <w:i w:val="0"/>
+          <w:color w:val="1F4E79"/>
+          <w:sz w:val="17"/>
+          <w:lang w:val="en-GB"/>
+        </w:rPr>
+        <w:t xml:space="preserve"> the number of classes, </w:t>
+      </w:r>
+      <m:oMath>
+        <m:sSub>
+          <m:e>
+            <m:r>
+              <w:rPr>
+                <w:rFonts w:ascii="Cambria Math" w:hAnsi="Cambria Math"/>
+                <w:color w:val="1F4E79"/>
+                <w:sz w:val="18"/>
+              </w:rPr>
+              <m:t>d</m:t>
+            </m:r>
+          </m:e>
+          <m:sub>
+            <m:r>
+              <w:rPr>
+                <w:rFonts w:ascii="Cambria Math" w:hAnsi="Cambria Math"/>
+                <w:color w:val="1F4E79"/>
+                <w:sz w:val="18"/>
+              </w:rPr>
+              <m:t>m</m:t>
+            </m:r>
+          </m:sub>
+        </m:sSub>
+      </m:oMath>
+      <w:r>
+        <w:rPr>
+          <w:rFonts w:ascii="Verdana" w:hAnsi="Verdana"/>
+          <w:b w:val="0"/>
+          <w:i w:val="0"/>
+          <w:color w:val="1F4E79"/>
+          <w:sz w:val="17"/>
+          <w:lang w:val="en-GB"/>
+        </w:rPr>
+        <w:t xml:space="preserve"> the input width of modality </w:t>
+      </w:r>
+      <m:oMath>
+        <m:r>
+          <w:rPr>
+            <w:rFonts w:ascii="Cambria Math" w:hAnsi="Cambria Math"/>
+            <w:color w:val="1F4E79"/>
+            <w:sz w:val="18"/>
+          </w:rPr>
+          <m:t>m</m:t>
+        </m:r>
+      </m:oMath>
+      <w:r>
+        <w:rPr>
+          <w:rFonts w:ascii="Verdana" w:hAnsi="Verdana"/>
+          <w:b w:val="0"/>
+          <w:i w:val="0"/>
+          <w:color w:val="1F4E79"/>
+          <w:sz w:val="17"/>
+          <w:lang w:val="en-GB"/>
+        </w:rPr>
+        <w:t xml:space="preserve">, </w:t>
+      </w:r>
+      <m:oMath>
+        <m:sSub>
+          <m:e>
+            <m:r>
+              <w:rPr>
+                <w:rFonts w:ascii="Cambria Math" w:hAnsi="Cambria Math"/>
+                <w:color w:val="1F4E79"/>
+                <w:sz w:val="18"/>
+              </w:rPr>
+              <m:t>N</m:t>
+            </m:r>
+          </m:e>
+          <m:sub>
+            <m:r>
+              <w:rPr>
+                <w:rFonts w:ascii="Cambria Math" w:hAnsi="Cambria Math"/>
+                <w:color w:val="1F4E79"/>
+                <w:sz w:val="18"/>
+              </w:rPr>
+              <m:t>i</m:t>
+            </m:r>
+          </m:sub>
+        </m:sSub>
+      </m:oMath>
+      <w:r>
+        <w:rPr>
+          <w:rFonts w:ascii="Verdana" w:hAnsi="Verdana"/>
+          <w:b w:val="0"/>
+          <w:i w:val="0"/>
+          <w:color w:val="1F4E79"/>
+          <w:sz w:val="17"/>
+          <w:lang w:val="en-GB"/>
+        </w:rPr>
+        <w:t xml:space="preserve"> and </w:t>
+      </w:r>
+      <m:oMath>
+        <m:sSub>
+          <m:e>
+            <m:r>
+              <w:rPr>
+                <w:rFonts w:ascii="Cambria Math" w:hAnsi="Cambria Math"/>
+                <w:color w:val="1F4E79"/>
+                <w:sz w:val="18"/>
+              </w:rPr>
+              <m:t>N</m:t>
+            </m:r>
+          </m:e>
+          <m:sub>
+            <m:r>
+              <w:rPr>
+                <w:rFonts w:ascii="Cambria Math" w:hAnsi="Cambria Math"/>
+                <w:color w:val="1F4E79"/>
+                <w:sz w:val="18"/>
+              </w:rPr>
+              <m:t>j</m:t>
+            </m:r>
+          </m:sub>
+        </m:sSub>
+      </m:oMath>
+      <w:r>
+        <w:rPr>
+          <w:rFonts w:ascii="Verdana" w:hAnsi="Verdana"/>
+          <w:b w:val="0"/>
+          <w:i w:val="0"/>
+          <w:color w:val="1F4E79"/>
+          <w:sz w:val="17"/>
+          <w:lang w:val="en-GB"/>
+        </w:rPr>
+        <w:t xml:space="preserve"> the numbers of positions or tokens, and </w:t>
+      </w:r>
+      <m:oMath>
+        <m:r>
+          <w:rPr>
+            <w:rFonts w:ascii="Cambria Math" w:hAnsi="Cambria Math"/>
+            <w:color w:val="1F4E79"/>
+            <w:sz w:val="18"/>
+          </w:rPr>
+          <m:t>d</m:t>
+        </m:r>
+      </m:oMath>
+      <w:r>
+        <w:rPr>
+          <w:rFonts w:ascii="Verdana" w:hAnsi="Verdana"/>
+          <w:b w:val="0"/>
+          <w:i w:val="0"/>
+          <w:color w:val="1F4E79"/>
+          <w:sz w:val="17"/>
+          <w:lang w:val="en-GB"/>
+        </w:rPr>
+        <w:t xml:space="preserve"> the latent dimension. The complexity terms describe representative operators rather than complete implementations.</w:t>
       </w:r>
     </w:p>
     <w:p>

</xml_diff>

<commit_message>
Standardise LULC terminology and synchronise submission files
</commit_message>
<xml_diff>
--- a/docs/review/response_to_reviewers_original_baseline_aligned.docx
+++ b/docs/review/response_to_reviewers_original_baseline_aligned.docx
@@ -59,7 +59,7 @@
           <w:sz w:val="19"/>
           <w:lang w:val="en-GB"/>
         </w:rPr>
-        <w:t>Manuscript title: Deep learning and multi-level fusion for land-use and land-cover classification: Technological evolution trajectory and future trends</w:t>
+        <w:t>Manuscript title: Deep learning and multi-level fusion for Land Use/Land Cover classification: Technological evolution trajectory and future trends</w:t>
       </w:r>
     </w:p>
     <w:p>
@@ -79,7 +79,7 @@
           <w:sz w:val="19"/>
           <w:lang w:val="en-GB"/>
         </w:rPr>
-        <w:t>The manuscript title is unchanged.</w:t>
+        <w:t>The original title wording is retained, with the LULC term standardised to Land Use/Land Cover.</w:t>
       </w:r>
     </w:p>
     <w:p>
@@ -119,7 +119,7 @@
           <w:sz w:val="19"/>
           <w:lang w:val="en-GB"/>
         </w:rPr>
-        <w:t>We thank the Editor and the three reviewers for their detailed and constructive comments. We have revised the manuscript to qualify unsupported claims, clarify the review methods, and address the technical and reporting issues raised. We have retained the original title and overall structure, making local corrections where possible and adding the requested discussions of learning strategies, foundation models, and reproducibility. The responses below explain the changes and the limits of the evidence available.</w:t>
+        <w:t>We thank the Editor and the three reviewers for their detailed and constructive comments. We have revised the manuscript to qualify unsupported claims, clarify the review methods, and address the technical and reporting issues raised. We have retained the original title wording and overall structure, with consistent spelling of Land Use/Land Cover, making local corrections where possible and adding the requested discussions of learning strategies, foundation models, and reproducibility. The responses below explain the changes and the limits of the evidence available.</w:t>
       </w:r>
     </w:p>
     <w:p>
@@ -481,7 +481,7 @@
           <w:sz w:val="18"/>
           <w:lang w:val="en-GB"/>
         </w:rPr>
-        <w:t>The screening sequence is now explicit: 283 initial records, two non-English records removed, and 20 records removed because they were neither Articles nor Proceeding Papers, leaving 261 records (231 Articles and 30 Proceeding Papers). Because the corpus came from one WoSCC retrieval, no cross-database merge was performed and no duplicates were removed. The revised workflow figure provides a PRISMA-style account of identification, exclusions and final inclusion while matching the analyses actually undertaken. We also reconciled the retained title-level materials: the intermediate working sheet contains 255 titles, and review of seven candidate omissions restored six eligible records, giving 255 + 6 = 261. The remaining candidate was excluded because it used fixed, non-learned convolutional kernels and explicitly avoided network training rather than applying a deep-learning model. The detailed working-sheet reconciliation is reported in this response and the supporting methodological notes; the manuscript retains the screening sequence and the distinction between the bibliometric corpus and the fusion-coding subset.</w:t>
+        <w:t>The screening sequence is now explicit: 283 initial records, two non-English records removed, and 20 records removed because they were neither Articles nor Proceedings Papers, leaving 261 records (231 Articles and 30 Proceedings Papers). Because the corpus came from one WoSCC retrieval, no cross-database merge was performed and no duplicates were removed. The revised workflow figure provides a PRISMA-style account of identification, exclusions and final inclusion while matching the analyses actually undertaken. We also reconciled the retained title-level materials: the intermediate working sheet contains 255 titles, and review of seven candidate omissions restored six eligible records, giving 255 + 6 = 261. The remaining candidate was excluded because it used fixed, non-learned convolutional kernels and explicitly avoided network training rather than applying a deep-learning model. The detailed working-sheet reconciliation is reported in this response and the supporting methodological notes; the manuscript retains the screening sequence and the distinction between the bibliometric corpus and the fusion-coding subset.</w:t>
       </w:r>
     </w:p>
     <w:p>
@@ -707,7 +707,7 @@
           <w:sz w:val="18"/>
           <w:lang w:val="en-GB"/>
         </w:rPr>
-        <w:t>We added a dedicated subsection on remote-sensing foundation models and multimodal pre-training. It distinguishes task-specific pre-training, remote-sensing foundation models, multimodal foundation models and vision–language models; discusses SatMAE, RemoteCLIP and multimodal adaptation; and evaluates the possible benefits of large-scale pre-training alongside geographic bias, class-taxonomy mismatch, compute cost, fine-tuning design and pre-training/evaluation leakage.</w:t>
+        <w:t>We added a dedicated subsection on remote sensing foundation models and multimodal pre-training. It distinguishes task-specific pre-training, remote sensing foundation models, multimodal foundation models and vision–language models; discusses SatMAE, RemoteCLIP and multimodal adaptation; and evaluates the possible benefits of large-scale pre-training alongside geographic bias, class-taxonomy mismatch, compute cost, fine-tuning design and pre-training/evaluation leakage.</w:t>
       </w:r>
     </w:p>
     <w:p>
@@ -2307,7 +2307,7 @@
           <w:sz w:val="18"/>
           <w:lang w:val="en-GB"/>
         </w:rPr>
-        <w:t>We revised the Conclusion while retaining its original five-paragraph structure. The main findings are now explicitly restricted to the retrieved corpus, and the research recommendations are more specific. The three existing directions—explainable AI, remote-sensing foundation models, and data governance and harmonisation—are supplemented with uncertainty calibration, domain adaptation and generalisation, continual learning, and standardised geographic and temporal evaluation. The foundation-model recommendation now also identifies geographic bias, leakage, computational cost and cross-region reliability as issues requiring evaluation.</w:t>
+        <w:t>We revised the Conclusion while retaining its original five-paragraph structure. The main findings are now explicitly restricted to the retrieved corpus, and the research recommendations are more specific. The three existing directions—explainable AI, remote sensing foundation models, and data governance and harmonisation—are supplemented with uncertainty calibration, domain adaptation and generalisation, continual learning, and standardised geographic and temporal evaluation. The foundation-model recommendation now also identifies geographic bias, leakage, computational cost and cross-region reliability as issues requiring evaluation.</w:t>
       </w:r>
     </w:p>
     <w:p>
@@ -2420,7 +2420,7 @@
           <w:sz w:val="18"/>
           <w:lang w:val="en-GB"/>
         </w:rPr>
-        <w:t>We corrected uses of LULCC and simulation where the intended task was LULC classification, and clarified the distinction between classification, change detection and land-change simulation. The Introduction now defines multi-source fusion as integration of observations or derived products from multiple sources, whereas multimodal learning concerns different measurement or representational characteristics. The foundation-model subsection also distinguishes foundation models, remote-sensing foundation models and vision–language models. Existing wording was retained where it conveyed the intended meaning accurately.</w:t>
+        <w:t>We corrected uses of LULCC and simulation where the intended task was LULC classification, and clarified the distinction between classification, change detection and land-change simulation. The Introduction now defines multi-source fusion as integration of observations or derived products from multiple sources, whereas multimodal learning concerns different measurement or representational characteristics. The foundation-model subsection also distinguishes foundation models, remote sensing foundation models and vision–language models. Existing wording was retained where it conveyed the intended meaning accurately. We also standardised Land Use/Land Cover (LULC), multimodal, pre-training, pre-trained and state-space models throughout the authors’ text, corrected the full expansion of TLCS, and defined WoSCC at its first abbreviated use.</w:t>
       </w:r>
     </w:p>
     <w:p>
@@ -4102,7 +4102,7 @@
           <w:sz w:val="18"/>
           <w:lang w:val="en-GB"/>
         </w:rPr>
-        <w:t>We expanded the Methods to report WoSCC Advanced Search, the Topic (TS) field and its searched fields, default institutional-subscription index coverage, the query, period, language and document-type filters, export format, screening counts, duplicate handling, keyword thesauri, affiliation-name checking and VOSviewer version 1.6.20. The workflow reports 283 initial records, exclusion of two non-English records and 20 non-Article/non-Proceeding-Paper records, and the final 261-record bibliometric corpus. The supporting tagged-text input and accession-number manifest allow the membership of the shared 261-record corpus to be checked. The retrieval month is reported as January 2026; the index description specifies the default subscription coverage rather than naming individual indexes that were not separately selected.</w:t>
+        <w:t>We expanded the Methods to report WoSCC Advanced Search, the Topic (TS) field and its searched fields, default institutional-subscription index coverage, the query, period, language and document-type filters, export format, screening counts, duplicate handling, keyword thesauri, affiliation-name checking and VOSviewer version 1.6.20. The workflow reports 283 initial records, exclusion of two non-English records and 20 non-Article/non-Proceedings-Paper records, and the final 261-record bibliometric corpus. The supporting tagged-text input and accession-number manifest allow the membership of the shared 261-record corpus to be checked. The retrieval month is reported as January 2026; the index description specifies the default subscription coverage rather than naming individual indexes that were not separately selected.</w:t>
       </w:r>
     </w:p>
     <w:p>

</xml_diff>

<commit_message>
Synchronise original-baseline diff and reviewer response with current source
</commit_message>
<xml_diff>
--- a/docs/review/response_to_reviewers_original_baseline_aligned.docx
+++ b/docs/review/response_to_reviewers_original_baseline_aligned.docx
@@ -368,7 +368,7 @@
           <w:sz w:val="18"/>
           <w:lang w:val="en-GB"/>
         </w:rPr>
-        <w:t>We also distinguished direct LULC-classification evidence from adjacent remote-sensing tasks. The suggested detection, UAV-localisation, retrieval and super-resolution studies are cited as sources of potentially transferable design questions, rather than as direct proof of LULC-classification performance. Publications from 2026 are explicitly treated as narrative updates after the 2006–2025 search window and are not included in any bibliometric count. This preserves the frozen analytical period while keeping the qualitative review current.</w:t>
+        <w:t xml:space="preserve">We also distinguished direct LULC-classification evidence from adjacent remote-sensing tasks. The suggested detection, UAV-localisation, retrieval and super-resolution studies are cited as sources of potentially transferable design questions, rather than as direct proof of LULC-classification performance. The suggested publications from 2026 inform the technical discussion; the bibliometric corpus remains limited to 2006–2025.</w:t>
       </w:r>
     </w:p>
     <w:p>
@@ -501,7 +501,7 @@
           <w:sz w:val="18"/>
           <w:lang w:val="en-GB"/>
         </w:rPr>
-        <w:t>We also document the archived keyword thesauri, the manual check of affiliation-name variants and VOSviewer version 1.6.20. Section 2.2 retains a concise description of keyword processing, the minimum occurrence of three inferred from retained keyword tables, the fusion-coding rules and the scope of the 261-record corpus and 163-record subset. The supporting methodological notes provide the detailed thesaurus mappings, retained item counts and limitations of the historical settings. The available screenshots document keyword-map controls only, including association-strength normalisation, clustering resolution 1.60 and minimum cluster size 1; these screenshot values are not attributed to the co-citation network. The separately author-confirmed co-citation settings are now reported in Section 4.2: association-strength normalisation, VOSviewer clustering resolution 1.00 and minimum cluster size 1. We do not claim that the retained materials establish every original map-creation setting or permit exact reconstruction of all network layouts. Retrieval is reported at month resolution as January 2026.</w:t>
+        <w:t xml:space="preserve">We also document the archived keyword thesauri, the manual check of affiliation-name variants and VOSviewer version 1.6.20. Section 2.2 retains a concise description of keyword processing, the minimum occurrence of three inferred from retained keyword tables, the fusion-coding rules and the scope of the 261-record corpus and 163-record subset. The supporting methodological notes provide the detailed thesaurus mappings, retained item counts and limitations of the historical settings. Following author confirmation, the captions of Figures 9–11 now report the same settings for the displayed keyword and co-citation maps: association-strength normalisation, VOSviewer clustering resolution 1.00 and minimum cluster size 1. Section 4.2 also reports these settings for the co-citation network. We do not claim that the retained materials establish every original map-creation setting or permit exact reconstruction of all network layouts. Retrieval is reported at month resolution as January 2026.</w:t>
       </w:r>
     </w:p>
     <w:p>
@@ -532,7 +532,7 @@
           <w:sz w:val="17"/>
           <w:lang w:val="en-GB"/>
         </w:rPr>
-        <w:t>Section 2, Data and Methods (Data Collection; Research Framework and Methodology); Table 1; Figure 1; Section 4.2, Intellectual Structure; Section 6, Reproducibility and Open Science. Detailed archival information: supporting methodological notes.</w:t>
+        <w:t xml:space="preserve">Section 2, Data and Methods (Data Collection; Research Framework and Methodology); Table 1; Figure 1; Figures 9–11 and their captions; Section 4.2, Intellectual Structure; Section 6, Reproducibility and Open Science. Detailed archival information: supporting methodological notes.</w:t>
       </w:r>
     </w:p>
     <w:p>
@@ -1582,7 +1582,7 @@
                 <w:sz w:val="18"/>
                 <w:lang w:val="en-GB"/>
               </w:rPr>
-              <w:t xml:space="preserve"> in attention memory (Vaswani et al., 2017).</w:t>
+              <w:t xml:space="preserve"> in attention memory.</w:t>
             </w:r>
           </w:p>
         </w:tc>
@@ -2032,6 +2032,17 @@
         </w:rPr>
         <w:t>Representative implementations comprise data-level fusion (Ghamisi et al., 2019; Pohl &amp; van Genderen, 1998), feature-level fusion (Ghamisi et al., 2017; Hong, Gao, et al., 2021; Zhang, Yao, Ni, Gao, &amp; Huang, 2023), decision-level fusion (Waske &amp; Benediktsson, 2007), and hybrid feature–decision fusion (Hang et al., 2020). These references illustrate the respective fusion levels; the risks and minimum-evidence recommendations are the authors' synthesis and are not attributed in full to any individual study.</w:t>
       </w:r>
+      <w:r>
+        <w:rPr>
+          <w:rFonts w:ascii="Verdana" w:hAnsi="Verdana"/>
+          <w:b w:val="0"/>
+          <w:i w:val="0"/>
+          <w:color w:val="1F4E79"/>
+          <w:sz w:val="17"/>
+          <w:lang w:val="en-GB"/>
+        </w:rPr>
+        <w:t xml:space="preserve"> Attention-complexity estimates are based on Vaswani et al. (2017).</w:t>
+      </w:r>
     </w:p>
     <w:p>
       <w:pPr>
@@ -2307,7 +2318,7 @@
           <w:sz w:val="18"/>
           <w:lang w:val="en-GB"/>
         </w:rPr>
-        <w:t>We revised the Conclusion while retaining its original five-paragraph structure. The main findings are now explicitly restricted to the retrieved corpus, and the research recommendations are more specific. The three existing directions—explainable AI, remote sensing foundation models, and data governance and harmonisation—are supplemented with uncertainty calibration, domain adaptation and generalisation, continual learning, and standardised geographic and temporal evaluation. The foundation-model recommendation now also identifies geographic bias, leakage, computational cost and cross-region reliability as issues requiring evaluation.</w:t>
+        <w:t xml:space="preserve">We revised the Conclusion while retaining its five-paragraph structure and the existing sentence wording wherever possible. The final shortening removes repetition and uses abbreviations already defined in the manuscript, without changing the findings or their qualifications. The main findings are now explicitly restricted to the retrieved corpus, and the research recommendations are more specific. The three existing directions—explainable AI, remote sensing foundation models, and data governance and harmonisation—are supplemented with uncertainty calibration, domain adaptation and generalisation, continual learning, and standardised geographic and temporal evaluation. The foundation-model recommendation now also identifies geographic bias, leakage, computational cost and cross-region reliability as issues requiring evaluation.</w:t>
       </w:r>
     </w:p>
     <w:p>
@@ -2553,7 +2564,7 @@
           <w:sz w:val="18"/>
           <w:lang w:val="en-GB"/>
         </w:rPr>
-        <w:t>VOSviewer selectively suppresses overlapping labels in dense networks. The keyword and co-citation captions now explain that only the more prominent labels are displayed, while all retained nodes contribute to network construction. The supporting item tables provide node labels and quantitative values independently of the visible labels. The retained network graphics were enlarged without recalculating their nodes or clusters. This improves the presentation, although the density of labels remains a limitation and should not be confused with insufficient pixel resolution.</w:t>
+        <w:t xml:space="preserve">VOSviewer selectively suppresses overlapping labels in dense networks. The keyword and co-citation captions now explain that only the more prominent labels are displayed, while all retained nodes contribute to network construction. The supporting item tables provide node labels and quantitative values independently of the visible labels. The captions also distinguish the visual encodings: Figure 9 uses colour for average publication year, Figure 10 shows keyword co-occurrence clusters, and Figure 11 shows cited-reference co-citation clusters. Figures 9–11 report the author-confirmed normalisation and clustering settings. Figure 8 explains country shading as publication output and blue lines as international co-authorship links, with thicker lines indicating more co-authored publications. The retained network graphics were enlarged without recalculating their nodes or clusters. This improves the presentation, although the density of labels remains a limitation and should not be confused with insufficient pixel resolution.</w:t>
       </w:r>
     </w:p>
     <w:p>
@@ -2584,7 +2595,7 @@
           <w:sz w:val="17"/>
           <w:lang w:val="en-GB"/>
         </w:rPr>
-        <w:t>Sections 4.1–4.2, Keyword Co-occurrence and Temporal Evolution and Intellectual Structure; Figures 9–11 and their captions; supporting figure audit and item tables.</w:t>
+        <w:t xml:space="preserve">Sections 4.1–4.2, Keyword Co-occurrence and Temporal Evolution and Intellectual Structure; Figures 8–11 and their captions; supporting figure audit and item tables.</w:t>
       </w:r>
     </w:p>
     <w:p>
@@ -2759,7 +2770,7 @@
           <w:sz w:val="18"/>
           <w:lang w:val="en-GB"/>
         </w:rPr>
-        <w:t>The section also recommends public benchmark identifiers, geographic and temporal hold-outs, class definitions, random seeds, preprocessing, code and configuration disclosure, compute reporting, per-class and calibration metrics, and missing-modality stress tests. The companion repository now includes the screened 261-record tagged-text input together with its UT-level manifest and checksum, allowing the analytical corpus membership to be checked directly.</w:t>
+        <w:t xml:space="preserve">Section 6 directs readers to the supporting materials. The detailed recommendations for future reproducible reporting are provided in the repository’s TODO.md: public benchmark identifiers, geographic and temporal hold-outs, class definitions, random seeds, preprocessing, code and configuration disclosure, compute reporting, per-class and calibration metrics, and missing-modality stress tests. The companion repository now includes the screened 261-record tagged-text input together with its UT-level manifest and checksum, allowing the analytical corpus membership to be checked directly.</w:t>
       </w:r>
     </w:p>
     <w:p>
@@ -2790,7 +2801,7 @@
           <w:sz w:val="17"/>
           <w:lang w:val="en-GB"/>
         </w:rPr>
-        <w:t>Section 6, Reproducibility and Open Science.</w:t>
+        <w:t xml:space="preserve">Section 6, Reproducibility and Open Science. Detailed future-reporting recommendations: TODO.md in the companion repository (https://github.com/cj1102/DL-LULC-Fusion-Review/blob/main/TODO.md).</w:t>
       </w:r>
     </w:p>
     <w:p>
@@ -3181,7 +3192,7 @@
           <w:sz w:val="18"/>
           <w:lang w:val="en-GB"/>
         </w:rPr>
-        <w:t>We added a separate subsection on learning strategies beyond architecture design. It discusses self-supervised pre-training, semi-supervised learning, domain adaptation, domain generalisation, class-balanced and cost-sensitive learning, uncertainty estimation and calibration, and training/evaluation under missing, corrupted or asynchronous modalities.</w:t>
+        <w:t xml:space="preserve">We added a separate subsection on learning strategies beyond architecture design. Its opening connects the preceding discussion of fusion levels and architectures to the role of learning strategies in multimodal LULC classification. It discusses self-supervised pre-training, semi-supervised learning, domain adaptation, domain generalisation, class-balanced and cost-sensitive learning, uncertainty estimation and calibration, and training/evaluation under missing, corrupted or asynchronous modalities.</w:t>
       </w:r>
     </w:p>
     <w:p>
@@ -4162,7 +4173,7 @@
           <w:sz w:val="18"/>
           <w:lang w:val="en-GB"/>
         </w:rPr>
-        <w:t>For the network analyses, the supporting materials preserve the keyword thesauri, item-level output tables and retained figures. Section 2.2 gives the cleaning rules and directs readers to the evidence and reconstruction limits in the supporting methodological notes. The detailed methodological notes disclose the original mappings, including broader concept aggregation, the retained item counts, the missing historical settings and the limits of reconstruction. Cropped screenshots document visible keyword-map normalisation, layout, clustering and display controls; they do not establish the settings of every network, unshown counting methods, random seeds or advanced controls. The keyword-map resolution of 1.60 is distinct from the separately author-confirmed co-citation resolution of 1.00. Section 4.2 now reports the confirmed co-citation settings, including association-strength normalisation and minimum cluster size 1. These materials support inspection of the retained outputs, but do not guarantee an identical rerun of every network.</w:t>
+        <w:t xml:space="preserve">For the network analyses, the supporting materials preserve the keyword thesauri, item-level output tables and retained figures. Section 2.2 gives the cleaning rules and directs readers to the evidence and reconstruction limits in the supporting methodological notes. The detailed methodological notes disclose the original mappings, including broader concept aggregation, the retained item counts, the missing historical settings and the limits of reconstruction. Cropped screenshots document visible keyword-map normalisation, layout, clustering and display controls; they do not establish the settings of every network, unshown counting methods, random seeds or advanced controls. The author subsequently confirmed the settings for all three displayed maps. Figures 9–11 now report association-strength normalisation, VOSviewer clustering resolution 1.00 and minimum cluster size 1. Section 4.2 also reports these settings for the co-citation network. These materials support inspection of the retained outputs, but do not guarantee an identical rerun of every network.</w:t>
       </w:r>
     </w:p>
     <w:p>

</xml_diff>